<commit_message>
final task where not exists fix
</commit_message>
<xml_diff>
--- a/SQL_Bohdan_Solovei_FinalTask_HouseholdStore_descriptions.docx
+++ b/SQL_Bohdan_Solovei_FinalTask_HouseholdStore_descriptions.docx
@@ -507,10 +507,7 @@
           </w:tcPr>
           <w:p>
             <w:r>
-              <w:t>S</w:t>
-            </w:r>
-            <w:r>
-              <w:t>upplier</w:t>
+              <w:t>Supplier</w:t>
             </w:r>
           </w:p>
         </w:tc>
@@ -811,10 +808,7 @@
           </w:tcPr>
           <w:p>
             <w:r>
-              <w:t>C</w:t>
-            </w:r>
-            <w:r>
-              <w:t>ustomer</w:t>
+              <w:t>Customer</w:t>
             </w:r>
           </w:p>
         </w:tc>
@@ -1161,10 +1155,7 @@
           </w:tcPr>
           <w:p>
             <w:r>
-              <w:t>P</w:t>
-            </w:r>
-            <w:r>
-              <w:t>roduct</w:t>
+              <w:t>Product</w:t>
             </w:r>
           </w:p>
         </w:tc>
@@ -2475,11 +2466,6 @@
       </w:r>
     </w:p>
     <w:p>
-      <w:pPr>
-        <w:rPr>
-          <w:rFonts w:hint="eastAsia"/>
-        </w:rPr>
-      </w:pPr>
       <w:proofErr w:type="spellStart"/>
       <w:proofErr w:type="gramStart"/>
       <w:r>
@@ -2524,11 +2510,6 @@
       <w:proofErr w:type="spellEnd"/>
     </w:p>
     <w:p>
-      <w:pPr>
-        <w:rPr>
-          <w:rFonts w:hint="eastAsia"/>
-        </w:rPr>
-      </w:pPr>
       <w:proofErr w:type="spellStart"/>
       <w:proofErr w:type="gramStart"/>
       <w:r>
@@ -2573,11 +2554,6 @@
       <w:proofErr w:type="spellEnd"/>
     </w:p>
     <w:p>
-      <w:pPr>
-        <w:rPr>
-          <w:rFonts w:hint="eastAsia"/>
-        </w:rPr>
-      </w:pPr>
       <w:proofErr w:type="spellStart"/>
       <w:r>
         <w:rPr>
@@ -2629,11 +2605,6 @@
       <w:proofErr w:type="spellEnd"/>
     </w:p>
     <w:p>
-      <w:pPr>
-        <w:rPr>
-          <w:rFonts w:hint="eastAsia"/>
-        </w:rPr>
-      </w:pPr>
       <w:proofErr w:type="spellStart"/>
       <w:r>
         <w:rPr>
@@ -2684,11 +2655,6 @@
       <w:proofErr w:type="spellEnd"/>
     </w:p>
     <w:p>
-      <w:pPr>
-        <w:rPr>
-          <w:rFonts w:hint="eastAsia"/>
-        </w:rPr>
-      </w:pPr>
       <w:proofErr w:type="spellStart"/>
       <w:r>
         <w:rPr>
@@ -3055,6 +3021,32 @@
       <w:proofErr w:type="spellEnd"/>
       <w:r>
         <w:t xml:space="preserve"> &gt; 0</w:t>
+      </w:r>
+    </w:p>
+    <w:p>
+      <w:proofErr w:type="spellStart"/>
+      <w:r>
+        <w:t>chk_order_item_discount_range</w:t>
+      </w:r>
+      <w:proofErr w:type="spellEnd"/>
+      <w:r>
+        <w:br/>
+      </w:r>
+      <w:proofErr w:type="spellStart"/>
+      <w:r>
+        <w:t>discount_percent</w:t>
+      </w:r>
+      <w:proofErr w:type="spellEnd"/>
+      <w:r>
+        <w:t xml:space="preserve"> &gt;= 0 AND </w:t>
+      </w:r>
+      <w:proofErr w:type="spellStart"/>
+      <w:r>
+        <w:t>discount_percent</w:t>
+      </w:r>
+      <w:proofErr w:type="spellEnd"/>
+      <w:r>
+        <w:t xml:space="preserve"> &lt;= 100</w:t>
       </w:r>
     </w:p>
     <w:p/>

</xml_diff>